<commit_message>
Enhance ATS dorking logic: improve locality handling for queries and add retry mechanism for DDG requests
</commit_message>
<xml_diff>
--- a/Aaron 2026 Resume.docx
+++ b/Aaron 2026 Resume.docx
@@ -23,7 +23,22 @@
         <w:jc w:val="center"/>
       </w:pPr>
       <w:r>
-        <w:t>1406 Chowan Ave, Durham, NC 27713 • ae166@duke.edu • (301) 706-1706</w:t>
+        <w:rPr>
+          <w:b/>
+          <w:bCs/>
+          <w:sz w:val="24"/>
+          <w:szCs w:val="24"/>
+        </w:rPr>
+        <w:t>Neural Signal Processing &amp; BCI Engineer</w:t>
+      </w:r>
+    </w:p>
+    <w:p>
+      <w:pPr>
+        <w:spacing w:after="80"/>
+        <w:jc w:val="center"/>
+      </w:pPr>
+      <w:r>
+        <w:t>Durham, NC • ae166@duke.edu</w:t>
       </w:r>
     </w:p>
     <w:p>
@@ -31,7 +46,7 @@
         <w:pBdr>
           <w:bottom w:val="single" w:sz="6" w:space="1" w:color="auto"/>
         </w:pBdr>
-        <w:spacing w:before="140" w:after="60"/>
+        <w:spacing w:before="120" w:after="50"/>
       </w:pPr>
       <w:r>
         <w:rPr>
@@ -50,7 +65,7 @@
           <w:ilvl w:val="0"/>
           <w:numId w:val="2"/>
         </w:numPr>
-        <w:spacing w:after="40"/>
+        <w:spacing w:after="30"/>
       </w:pPr>
       <w:r>
         <w:t>7+ years scientific Python with deep PyTorch expertise; hand-written CUDA C kernels (CuPy RawKernel); SQL (SQLite); C/C++, MATLAB, Bash; contributor to MNE-Python (merged PR).</w:t>
@@ -63,7 +78,7 @@
           <w:ilvl w:val="0"/>
           <w:numId w:val="2"/>
         </w:numPr>
-        <w:spacing w:after="40"/>
+        <w:spacing w:after="30"/>
       </w:pPr>
       <w:r>
         <w:t xml:space="preserve">Maintainer of </w:t>
@@ -86,7 +101,7 @@
         <w:t>ieeg</w:t>
       </w:r>
       <w:r>
-        <w:t>) with CI/CD, used inside and outside the Cogan Lab.</w:t>
+        <w:t>) with CI/CD and code review on every pull request, used inside and outside the Cogan Lab.</w:t>
       </w:r>
     </w:p>
     <w:p>
@@ -96,7 +111,7 @@
           <w:ilvl w:val="0"/>
           <w:numId w:val="2"/>
         </w:numPr>
-        <w:spacing w:after="40"/>
+        <w:spacing w:after="30"/>
       </w:pPr>
       <w:r>
         <w:t>First-author BCI paper in preparation: PyTorch tensor-decomposition decoder for speech-prosthesis development. Presented at SfN (2022, 2023, 2024), AAAS (2025), CNS (2024), Duke TBS (2022, 2023).</w:t>
@@ -109,7 +124,7 @@
           <w:ilvl w:val="0"/>
           <w:numId w:val="2"/>
         </w:numPr>
-        <w:spacing w:after="40"/>
+        <w:spacing w:after="30"/>
       </w:pPr>
       <w:r>
         <w:t>Data infrastructure lead for a clinical neuroscience lab operating inside an FDA-regulated research environment: own the de-identification, data-integrity, and reproducibility layer of an active investigational uECoG study (up to 1024-channel arrays) under IDE and IRB oversight; led the lab-wide migration from MATLAB/Windows to Python/Linux/BIDS.</w:t>
@@ -122,7 +137,7 @@
           <w:ilvl w:val="0"/>
           <w:numId w:val="2"/>
         </w:numPr>
-        <w:spacing w:after="40"/>
+        <w:spacing w:after="30"/>
       </w:pPr>
       <w:r>
         <w:t>Data engineering across the stack: BIDS/NWB/DANDI standards, PHI removal, SQLite schema design with additive migrations, ETL pipelines, HPC (SLURM) and AWS, GitHub Actions CI/CD.</w:t>
@@ -135,7 +150,7 @@
           <w:ilvl w:val="0"/>
           <w:numId w:val="2"/>
         </w:numPr>
-        <w:spacing w:after="40"/>
+        <w:spacing w:after="30"/>
       </w:pPr>
       <w:r>
         <w:t>Medical-device design-controls exposure: on a six-person Duke team building an academic Design History File per 21 CFR 820.30 for a patented Class II junctional tourniquet, personally owned the ISO 14971 Design FMECA (40+ failure modes) and a 164-standard applicability database (18 SDOs). MEng BME + Medical Device Design Certificate (Duke); BS Bioengineering (Cornell).</w:t>
@@ -146,7 +161,7 @@
         <w:pBdr>
           <w:bottom w:val="single" w:sz="6" w:space="1" w:color="auto"/>
         </w:pBdr>
-        <w:spacing w:before="140" w:after="60"/>
+        <w:spacing w:before="120" w:after="50"/>
       </w:pPr>
       <w:r>
         <w:rPr>
@@ -163,7 +178,7 @@
         <w:tabs>
           <w:tab w:val="right" w:pos="9026"/>
         </w:tabs>
-        <w:spacing w:before="80" w:after="20"/>
+        <w:spacing w:before="65" w:after="16"/>
       </w:pPr>
       <w:r>
         <w:rPr>
@@ -178,36 +193,18 @@
           <w:iCs/>
         </w:rPr>
         <w:tab/>
-        <w:t xml:space="preserve">Jan 2025 </w:t>
-      </w:r>
-      <w:r>
-        <w:rPr>
-          <w:i/>
-          <w:iCs/>
-        </w:rPr>
-        <w:t>–</w:t>
-      </w:r>
-      <w:r>
-        <w:rPr>
-          <w:i/>
-          <w:iCs/>
-        </w:rPr>
-        <w:t xml:space="preserve"> </w:t>
-      </w:r>
-      <w:r>
-        <w:rPr>
-          <w:i/>
-          <w:iCs/>
-        </w:rPr>
-        <w:t>June 2026</w:t>
-      </w:r>
-    </w:p>
-    <w:p>
-      <w:pPr>
-        <w:spacing w:after="40"/>
-      </w:pPr>
-      <w:r>
-        <w:t>Lead data infrastructure for a clinical neuroscience lab conducting research under FDA Investigational Device Exemption (IDE) and Duke IRB oversight, collaborating with the Viventi Lab on high-density uECoG investigational neural arrays (up to 1024 channels) used intraoperatively at Duke University Medical Center. Author and version-control the lab's analysis pipelines; maintain BIDS-standard data systems with PHI removal for NWB/DANDI compliance. Migrated the lab from MATLAB/Windows to a Python/Linux stack with cloud-deployable scripts, managing a live clinical pipeline cutover; CI caught a numpy 2.0 ABI break and a silent mne-bids regression before they reached collaborators. Public lab GitHub: github.com/coganlab. Supervisor: Greg Cogan, PhD.</w:t>
+        <w:t>Jan 2025 – June 2026</w:t>
+      </w:r>
+    </w:p>
+    <w:p>
+      <w:pPr>
+        <w:spacing w:after="30"/>
+      </w:pPr>
+      <w:r>
+        <w:t>Lead data infrastructure for a clinical neuroscience lab conducting research under FDA Investigational Device Exemption (IDE) and Duke IRB oversight, collaborating with the Viventi Lab on high-density uECoG investigational neural arrays (up to 1024 channels) used intraoperatively at Duke University Medical Center. Author and version-control the lab's analysis pipelines; maintain BIDS-standard data systems with PHI removal for NWB/DANDI compliance. Migrated the lab from MATLAB/Windows to a Python/Linux stack</w:t>
+      </w:r>
+      <w:r>
+        <w:t xml:space="preserve"> with cloud-deployable scripts, managing a live clinical pipeline cutover; CI caught a numpy 2.0 ABI break and a silent mne-bids regression before they reached collaborators. Public lab GitHub: github.com/coganlab. Supervisor: Greg Cogan, PhD.</w:t>
       </w:r>
     </w:p>
     <w:p>
@@ -215,7 +212,7 @@
         <w:tabs>
           <w:tab w:val="right" w:pos="9026"/>
         </w:tabs>
-        <w:spacing w:before="80" w:after="20"/>
+        <w:spacing w:before="65" w:after="16"/>
       </w:pPr>
       <w:r>
         <w:rPr>
@@ -235,10 +232,10 @@
     </w:p>
     <w:p>
       <w:pPr>
-        <w:spacing w:after="40"/>
-      </w:pPr>
-      <w:r>
-        <w:t>Converted Cogan Lab data systems to the BIDS standard with PHI removal for NWB/DANDI compliance. Created new ECoG/iEEG analysis pipelines (Python/BIDS). Led the infrastructure transition from MATLAB/Windows to Python/Linux. Supported intracranial neural recording collaborations across Duke Neurology, Neurosurgery, and the Viventi Lab.</w:t>
+        <w:spacing w:after="30"/>
+      </w:pPr>
+      <w:r>
+        <w:t>Converted Cogan Lab data systems to the BIDS standard with PHI removal for NWB/DANDI compliance. Created new ECoG/iEEG analysis pipelines (Python/BIDS). Led the infrastructure transition from MATLAB/Windows to Python/Linux. Supported cross-functional intracranial neural recording collaborations across Duke Neurology, Neurosurgery, and the Viventi Lab.</w:t>
       </w:r>
     </w:p>
     <w:p>
@@ -246,7 +243,7 @@
         <w:tabs>
           <w:tab w:val="right" w:pos="9026"/>
         </w:tabs>
-        <w:spacing w:before="80" w:after="20"/>
+        <w:spacing w:before="65" w:after="16"/>
       </w:pPr>
       <w:r>
         <w:rPr>
@@ -266,7 +263,7 @@
     </w:p>
     <w:p>
       <w:pPr>
-        <w:spacing w:after="40"/>
+        <w:spacing w:after="30"/>
       </w:pPr>
       <w:r>
         <w:t>Built an AWS-deployed fMRI preprocessing server for Cornell's functional MRI research data using the BIDS format. Integrated FSL, AFNI, FreeSurfer, and ME-ICA via Python Nipype with multi-threaded Python and Bash. Supervisor: Khena Swallow, PhD.</w:t>
@@ -277,7 +274,7 @@
         <w:tabs>
           <w:tab w:val="right" w:pos="9026"/>
         </w:tabs>
-        <w:spacing w:before="80" w:after="20"/>
+        <w:spacing w:before="65" w:after="16"/>
       </w:pPr>
       <w:r>
         <w:rPr>
@@ -297,7 +294,7 @@
     </w:p>
     <w:p>
       <w:pPr>
-        <w:spacing w:after="40"/>
+        <w:spacing w:after="30"/>
       </w:pPr>
       <w:r>
         <w:t>Recruited and surveyed participants per experimental design. Identified a study design flaw that led to significant protocol changes. Supported an fMRI study measuring activity in the Locus Coeruleus. Supervisor: Khena Swallow, PhD.</w:t>
@@ -308,7 +305,7 @@
         <w:tabs>
           <w:tab w:val="right" w:pos="9026"/>
         </w:tabs>
-        <w:spacing w:before="80" w:after="20"/>
+        <w:spacing w:before="65" w:after="16"/>
       </w:pPr>
       <w:r>
         <w:rPr>
@@ -328,7 +325,7 @@
     </w:p>
     <w:p>
       <w:pPr>
-        <w:spacing w:after="40"/>
+        <w:spacing w:after="30"/>
       </w:pPr>
       <w:r>
         <w:t>Center for Pain and the Brain. Analyzed MRI and DTI data using MATLAB and Bash to predict demyelination and other neurodegeneration in pediatric patients. Applied machine learning to predict spinal disease pathogenesis. Conducted patient chart reviews for retrospective studies. Supervisor: Nadia Barakat, PhD.</w:t>
@@ -339,7 +336,7 @@
         <w:pBdr>
           <w:bottom w:val="single" w:sz="6" w:space="1" w:color="auto"/>
         </w:pBdr>
-        <w:spacing w:before="140" w:after="60"/>
+        <w:spacing w:before="120" w:after="50"/>
       </w:pPr>
       <w:r>
         <w:rPr>
@@ -353,7 +350,7 @@
     </w:p>
     <w:p>
       <w:pPr>
-        <w:spacing w:after="40"/>
+        <w:spacing w:after="30"/>
       </w:pPr>
       <w:r>
         <w:t xml:space="preserve">Full list: </w:t>
@@ -372,7 +369,7 @@
         <w:tabs>
           <w:tab w:val="right" w:pos="9026"/>
         </w:tabs>
-        <w:spacing w:before="80" w:after="20"/>
+        <w:spacing w:before="65" w:after="16"/>
       </w:pPr>
       <w:r>
         <w:rPr>
@@ -392,7 +389,7 @@
     </w:p>
     <w:p>
       <w:pPr>
-        <w:spacing w:after="40"/>
+        <w:spacing w:after="30"/>
       </w:pPr>
       <w:r>
         <w:t>First-author paper in preparation. PyTorch-based decoder applying unsupervised tensor decomposition (sliceTCA, forked and extended from Pellegrino et al.) to iEEG recordings from epilepsy, movement disorder, and tumor patients undergoing pre-surgical intracranial monitoring at Duke. Identifies latent neural sub-processes bridging speech perception and production without imposing a priori anatomical bias; supports speech-prosthesis BCI development. CUDA-accelerated.</w:t>
@@ -403,7 +400,7 @@
         <w:tabs>
           <w:tab w:val="right" w:pos="9026"/>
         </w:tabs>
-        <w:spacing w:before="80" w:after="20"/>
+        <w:spacing w:before="65" w:after="16"/>
       </w:pPr>
       <w:r>
         <w:rPr>
@@ -418,12 +415,18 @@
           <w:iCs/>
         </w:rPr>
         <w:tab/>
+      </w:r>
+      <w:r>
+        <w:rPr>
+          <w:i/>
+          <w:iCs/>
+        </w:rPr>
         <w:t>Jul 2021 - present</w:t>
       </w:r>
     </w:p>
     <w:p>
       <w:pPr>
-        <w:spacing w:after="40"/>
+        <w:spacing w:after="30"/>
       </w:pPr>
       <w:r>
         <w:t xml:space="preserve">Open-source iEEG/ECoG analysis stack for the Cogan Lab: BIDS conversion, PHI removal for NWB/DANDI compliance, GPU-accelerated signal processing (hand-written CUDA kernels via CuPy RawKernel), GitHub Actions CI/CD, pip-installable as </w:t>
@@ -444,7 +447,7 @@
         <w:tabs>
           <w:tab w:val="right" w:pos="9026"/>
         </w:tabs>
-        <w:spacing w:before="80" w:after="20"/>
+        <w:spacing w:before="65" w:after="16"/>
       </w:pPr>
       <w:r>
         <w:rPr>
@@ -464,11 +467,14 @@
     </w:p>
     <w:p>
       <w:pPr>
-        <w:spacing w:after="40"/>
-      </w:pPr>
+        <w:spacing w:after="30"/>
+      </w:pPr>
+      <w:r>
+        <w:t xml:space="preserve">Job-search crawler integrating ten ATS APIs (Greenhouse, Lever, Ashby, Workday, and others) with thread-pooled fetching, an LLM-assisted company-discovery pipeline, resume-fit scoring via the Claude API, and browser-capture ingestion of gated job boards. </w:t>
+      </w:r>
       <w:r>
         <w:lastRenderedPageBreak/>
-        <w:t>Job-search crawler integrating ten ATS APIs (Greenhouse, Lever, Ashby, Workday, and others) with thread-pooled fetching, an LLM-assisted company-discovery pipeline, resume-fit scoring via the Claude API, and browser-capture ingestion of gated job boards. SQLite persistence layer designed from scratch: normalized companies/jobs schema, additive idempotent migrations, upsert semantics, ranked join queries. Public: github.com/Aaronearlerichardson/Jobs</w:t>
+        <w:t>SQLite persistence layer designed from scratch: normalized companies/jobs schema, additive idempotent migrations, upsert semantics, ranked join queries. Public: github.com/Aaronearlerichardson/Jobs</w:t>
       </w:r>
     </w:p>
     <w:p>
@@ -476,7 +482,7 @@
         <w:tabs>
           <w:tab w:val="right" w:pos="9026"/>
         </w:tabs>
-        <w:spacing w:before="80" w:after="20"/>
+        <w:spacing w:before="65" w:after="16"/>
       </w:pPr>
       <w:r>
         <w:rPr>
@@ -496,10 +502,13 @@
     </w:p>
     <w:p>
       <w:pPr>
-        <w:spacing w:after="40"/>
-      </w:pPr>
-      <w:r>
-        <w:t>Academic design-controls project: co-developed a pneumatic junctional tourniquet for traumatic axillary and inguinal hemorrhage on a six-person Duke engineering team building an academic Design History File per 21 CFR 820.30. Personally owned the ISO 14971 Design FMECA (40+ failure modes) and the applicable-standards database (164 standards, 18 SDOs, each mapped with applicability rationale); contributed to four-predicate 510(k) analysis (CRoC, SAM Junctional, JETT, AAJT) and reliability-based verification sample sizing, with executed pressure and strap-failure testing. Patented; 2nd place, Innovate Carolina 2021; presented to the Chairman of the Joint Chiefs of Staff.</w:t>
+        <w:spacing w:after="30"/>
+      </w:pPr>
+      <w:r>
+        <w:t xml:space="preserve">Academic design-controls project: co-developed a pneumatic junctional tourniquet for traumatic axillary and inguinal hemorrhage on a six-person Duke engineering team building an academic Design History File per 21 CFR 820.30. Personally owned the ISO 14971 Design FMECA (40+ failure modes) and the applicable-standards database (164 standards, 18 SDOs, each mapped with applicability rationale); contributed to four-predicate 510(k) analysis (CRoC, SAM Junctional, JETT, AAJT) and reliability-based verification </w:t>
+      </w:r>
+      <w:r>
+        <w:t>sample sizing, with executed pressure and strap-failure testing. Patented; 2nd place, Innovate Carolina 2021; presented to the Chairman of the Joint Chiefs of Staff.</w:t>
       </w:r>
     </w:p>
     <w:p>
@@ -507,7 +516,7 @@
         <w:tabs>
           <w:tab w:val="right" w:pos="9026"/>
         </w:tabs>
-        <w:spacing w:before="80" w:after="20"/>
+        <w:spacing w:before="65" w:after="16"/>
       </w:pPr>
       <w:r>
         <w:rPr>
@@ -527,7 +536,7 @@
     </w:p>
     <w:p>
       <w:pPr>
-        <w:spacing w:after="40"/>
+        <w:spacing w:after="30"/>
       </w:pPr>
       <w:r>
         <w:t>Led a team building an in-ear EEG device for personal identification (Cornell capstone): MATLAB ML classifier, later deep neural networks for motion-artifact rejection. First project-management role.</w:t>
@@ -538,7 +547,7 @@
         <w:tabs>
           <w:tab w:val="right" w:pos="9026"/>
         </w:tabs>
-        <w:spacing w:before="80" w:after="20"/>
+        <w:spacing w:before="65" w:after="16"/>
       </w:pPr>
       <w:r>
         <w:rPr>
@@ -558,7 +567,7 @@
     </w:p>
     <w:p>
       <w:pPr>
-        <w:spacing w:after="40"/>
+        <w:spacing w:after="30"/>
       </w:pPr>
       <w:r>
         <w:t>Cornell fMRI preprocessing pipeline (BIDS, multi-threaded Python, Bash, FSL/AFNI/FreeSurfer/ME-ICA). github.com/Aaronearlerichardson/CMRIF_preprocess</w:t>
@@ -569,7 +578,7 @@
         <w:tabs>
           <w:tab w:val="right" w:pos="9026"/>
         </w:tabs>
-        <w:spacing w:before="80" w:after="20"/>
+        <w:spacing w:before="65" w:after="16"/>
       </w:pPr>
       <w:r>
         <w:rPr>
@@ -589,7 +598,7 @@
     </w:p>
     <w:p>
       <w:pPr>
-        <w:spacing w:after="40"/>
+        <w:spacing w:after="30"/>
       </w:pPr>
       <w:r>
         <w:t>Object-oriented Python neuron simulation (github.com/Aaronearlerichardson/Neuron_sim); chemical reaction-pathway calculator using depth-first search (github.com/Shaumik-Ashraf/BiosystemsProject).</w:t>
@@ -600,7 +609,7 @@
         <w:pBdr>
           <w:bottom w:val="single" w:sz="6" w:space="1" w:color="auto"/>
         </w:pBdr>
-        <w:spacing w:before="140" w:after="60"/>
+        <w:spacing w:before="120" w:after="50"/>
       </w:pPr>
       <w:r>
         <w:rPr>
@@ -614,15 +623,15 @@
     </w:p>
     <w:p>
       <w:pPr>
-        <w:spacing w:after="40"/>
-      </w:pPr>
-      <w:r>
-        <w:t>Earle-Richardson, A. M., Duraivel, K., Southwell, D., Sinha, S., Vestal, M., Grant, G., Zafar, M., &amp; Cogan, G. B. Neural sub-processes linking speech perception and production. (In preparation.)</w:t>
-      </w:r>
-    </w:p>
-    <w:p>
-      <w:pPr>
-        <w:spacing w:after="40"/>
+        <w:spacing w:after="30"/>
+      </w:pPr>
+      <w:r>
+        <w:t>Earle-Richardson, A. M., Duraivel, K., Southwell, D., Sinha, S., Vestal, M., Grant, G., Zafar, M., &amp; Cogan, G. B. Neural sub-processes linking speech perception and production. (In preparation.) Presented as posters at the Society for Neuroscience (2022–2024) and Duke TBS Research Symposium (2022–2023).</w:t>
+      </w:r>
+    </w:p>
+    <w:p>
+      <w:pPr>
+        <w:spacing w:after="30"/>
       </w:pPr>
       <w:r>
         <w:t>Sexton, D. P., Earle-Richardson, A. M., Southwell, D. G., Vestal, M., &amp; Cogan, G. B. Decoding verbal working memory load from intracranial high gamma activity. AAAS, 2025.</w:t>
@@ -630,47 +639,15 @@
     </w:p>
     <w:p>
       <w:pPr>
-        <w:spacing w:after="40"/>
-      </w:pPr>
-      <w:r>
-        <w:t>Earle-Richardson, A. M., et al. Neural sub-processes linking speech perception and production. Society for Neuroscience, 2024.</w:t>
-      </w:r>
-    </w:p>
-    <w:p>
-      <w:pPr>
-        <w:spacing w:after="40"/>
-      </w:pPr>
-      <w:r>
-        <w:t>Zhang, J., Earle-Richardson, A. M., Southwell, D., Egner, T., &amp; Cogan, G. B. Intracranial EEG correlates of concurrent demands on cognitive stability and flexibility. Society for Neuroscience, 2024.</w:t>
-      </w:r>
-    </w:p>
-    <w:p>
-      <w:pPr>
-        <w:spacing w:after="40"/>
-      </w:pPr>
-      <w:r>
-        <w:t>Zhang, J., Earle-Richardson, A. M., Southwell, D., Frauscher, B., Egner, T., &amp; Cogan, G. B. Intracranial EEG correlates of concurrent demands on cognitive stability and flexibility. Cognitive Neuroscience Society, 2024.</w:t>
-      </w:r>
-    </w:p>
-    <w:p>
-      <w:pPr>
-        <w:spacing w:after="40"/>
-      </w:pPr>
-      <w:r>
-        <w:t>Earle-Richardson, A. M., et al. Using unsupervised decomposition to reveal the neural sub-processes that link speech perception and production. Society for Neuroscience, 2023; Duke TBS Research Symposium, 2023.</w:t>
-      </w:r>
-    </w:p>
-    <w:p>
-      <w:pPr>
-        <w:spacing w:after="40"/>
-      </w:pPr>
-      <w:r>
-        <w:t>Earle-Richardson, A. M., et al. Revealing the neural sub-processes that link speech perception and production with unsupervised decomposition. Society for Neuroscience, 2022; Duke TBS Research Symposium, 2022.</w:t>
-      </w:r>
-    </w:p>
-    <w:p>
-      <w:pPr>
-        <w:spacing w:after="40"/>
+        <w:spacing w:after="30"/>
+      </w:pPr>
+      <w:r>
+        <w:t>Zhang, J., Earle-Richardson, A. M., Southwell, D., Frauscher, B., Egner, T., &amp; Cogan, G. B. Intracranial EEG correlates of concurrent demands on cognitive stability and flexibility. Society for Neuroscience, 2024; Cognitive Neuroscience Society, 2024.</w:t>
+      </w:r>
+    </w:p>
+    <w:p>
+      <w:pPr>
+        <w:spacing w:after="30"/>
       </w:pPr>
       <w:r>
         <w:t>Earle-Richardson, A. M., Barakat, N. Exploration of methods in medical image data analysis. Cornell Bioengineering Conference, 2019.</w:t>
@@ -681,7 +658,7 @@
         <w:pBdr>
           <w:bottom w:val="single" w:sz="6" w:space="1" w:color="auto"/>
         </w:pBdr>
-        <w:spacing w:before="140" w:after="60"/>
+        <w:spacing w:before="120" w:after="50"/>
       </w:pPr>
       <w:r>
         <w:rPr>
@@ -698,7 +675,7 @@
         <w:tabs>
           <w:tab w:val="right" w:pos="9026"/>
         </w:tabs>
-        <w:spacing w:before="80" w:after="20"/>
+        <w:spacing w:before="65" w:after="16"/>
       </w:pPr>
       <w:r>
         <w:rPr>
@@ -718,7 +695,7 @@
     </w:p>
     <w:p>
       <w:pPr>
-        <w:spacing w:after="40"/>
+        <w:spacing w:after="30"/>
       </w:pPr>
       <w:r>
         <w:t>Master of Engineering, Biomedical Engineering; Medical Device Design Certificate</w:t>
@@ -729,7 +706,7 @@
         <w:tabs>
           <w:tab w:val="right" w:pos="9026"/>
         </w:tabs>
-        <w:spacing w:before="80" w:after="20"/>
+        <w:spacing w:before="65" w:after="16"/>
       </w:pPr>
       <w:r>
         <w:rPr>
@@ -749,7 +726,7 @@
     </w:p>
     <w:p>
       <w:pPr>
-        <w:spacing w:after="40"/>
+        <w:spacing w:after="30"/>
       </w:pPr>
       <w:r>
         <w:t>Bachelor of Science, Bioengineering (College of Agriculture and Life Sciences)</w:t>
@@ -760,7 +737,7 @@
         <w:tabs>
           <w:tab w:val="right" w:pos="9026"/>
         </w:tabs>
-        <w:spacing w:before="80" w:after="20"/>
+        <w:spacing w:before="65" w:after="16"/>
       </w:pPr>
       <w:r>
         <w:rPr>
@@ -780,7 +757,7 @@
     </w:p>
     <w:p>
       <w:pPr>
-        <w:spacing w:after="40"/>
+        <w:spacing w:after="30"/>
       </w:pPr>
       <w:r>
         <w:t>Transferred</w:t>
@@ -791,7 +768,7 @@
         <w:pBdr>
           <w:bottom w:val="single" w:sz="6" w:space="1" w:color="auto"/>
         </w:pBdr>
-        <w:spacing w:before="140" w:after="60"/>
+        <w:spacing w:before="120" w:after="50"/>
       </w:pPr>
       <w:r>
         <w:rPr>
@@ -810,7 +787,7 @@
           <w:ilvl w:val="0"/>
           <w:numId w:val="2"/>
         </w:numPr>
-        <w:spacing w:after="40"/>
+        <w:spacing w:after="30"/>
       </w:pPr>
       <w:r>
         <w:rPr>
@@ -820,7 +797,7 @@
         <w:t xml:space="preserve">Programming: </w:t>
       </w:r>
       <w:r>
-        <w:t>Python (PyTorch, NumPy, SciPy, pandas, MNE-Python, Nipype), CUDA (hand-written C kernels via CuPy RawKernel), SQL (SQLite: schema design, migrations, joins), C/C++, MATLAB, Bash/Shell, JavaScript, HTML/Liquid</w:t>
+        <w:t>Python (PyTorch, NumPy, SciPy, pandas, MNE-Python, Nipype), CUDA (hand-written C kernels via CuPy RawKernel), SQL (SQLite: schema design, migrations, joins), C/C++, MATLAB, Bash/Shell, JavaScript, HTML/Liquid, Git</w:t>
       </w:r>
     </w:p>
     <w:p>
@@ -830,7 +807,7 @@
           <w:ilvl w:val="0"/>
           <w:numId w:val="2"/>
         </w:numPr>
-        <w:spacing w:after="40"/>
+        <w:spacing w:after="30"/>
       </w:pPr>
       <w:r>
         <w:rPr>
@@ -850,7 +827,7 @@
           <w:ilvl w:val="0"/>
           <w:numId w:val="2"/>
         </w:numPr>
-        <w:spacing w:after="40"/>
+        <w:spacing w:after="30"/>
       </w:pPr>
       <w:r>
         <w:rPr>
@@ -870,7 +847,7 @@
           <w:ilvl w:val="0"/>
           <w:numId w:val="2"/>
         </w:numPr>
-        <w:spacing w:after="40"/>
+        <w:spacing w:after="30"/>
       </w:pPr>
       <w:r>
         <w:rPr>
@@ -880,7 +857,7 @@
         <w:t xml:space="preserve">Platforms: </w:t>
       </w:r>
       <w:r>
-        <w:t>Linux, AWS, Duke Compute Cluster (SLURM), GitHub Actions CI/CD, GitHub/GitLab Pages, ReadTheDocs, virtual machines (VirtualBox, WSL)</w:t>
+        <w:t>Linux, AWS, Duke Compute Cluster (SLURM), GitHub Actions CI/CD, GitHub Pages, ReadTheDocs, virtual machines (VirtualBox, WSL)</w:t>
       </w:r>
     </w:p>
     <w:p>
@@ -890,14 +867,13 @@
           <w:ilvl w:val="0"/>
           <w:numId w:val="2"/>
         </w:numPr>
-        <w:spacing w:after="40"/>
-      </w:pPr>
-      <w:r>
-        <w:rPr>
-          <w:b/>
-          <w:bCs/>
-        </w:rPr>
-        <w:lastRenderedPageBreak/>
+        <w:spacing w:after="30"/>
+      </w:pPr>
+      <w:r>
+        <w:rPr>
+          <w:b/>
+          <w:bCs/>
+        </w:rPr>
         <w:t xml:space="preserve">Hardware &amp; Design: </w:t>
       </w:r>
       <w:r>
@@ -911,14 +887,14 @@
           <w:ilvl w:val="0"/>
           <w:numId w:val="2"/>
         </w:numPr>
-        <w:spacing w:after="40"/>
-      </w:pPr>
-      <w:r>
-        <w:rPr>
-          <w:b/>
-          <w:bCs/>
-        </w:rPr>
-        <w:t xml:space="preserve">Quality &amp; Regulatory (academic exposure): </w:t>
+        <w:spacing w:after="30"/>
+      </w:pPr>
+      <w:r>
+        <w:rPr>
+          <w:b/>
+          <w:bCs/>
+        </w:rPr>
+        <w:t xml:space="preserve">Quality &amp; Regulatory: </w:t>
       </w:r>
       <w:r>
         <w:t>Design Controls (21 CFR 820.30), DHF, ISO 14971 FMECA, predicate-based 510(k) strategy, IEC 62366, ISO 10993 documentation review, ISO 13485 familiarity, FDA QMSR transition awareness; GCP-adjacent experience (investigational device research under IDE/IRB)</w:t>
@@ -931,7 +907,7 @@
           <w:ilvl w:val="0"/>
           <w:numId w:val="2"/>
         </w:numPr>
-        <w:spacing w:after="40"/>
+        <w:spacing w:after="30"/>
       </w:pPr>
       <w:r>
         <w:rPr>
@@ -949,7 +925,7 @@
         <w:pBdr>
           <w:bottom w:val="single" w:sz="6" w:space="1" w:color="auto"/>
         </w:pBdr>
-        <w:spacing w:before="140" w:after="60"/>
+        <w:spacing w:before="120" w:after="50"/>
       </w:pPr>
       <w:r>
         <w:rPr>
@@ -963,7 +939,7 @@
     </w:p>
     <w:p>
       <w:pPr>
-        <w:spacing w:after="40"/>
+        <w:spacing w:after="30"/>
       </w:pPr>
       <w:r>
         <w:t>Greg Cogan, PhD - Gregory.cogan@duke.edu</w:t>
@@ -971,7 +947,7 @@
     </w:p>
     <w:p>
       <w:pPr>
-        <w:spacing w:after="40"/>
+        <w:spacing w:after="30"/>
       </w:pPr>
       <w:r>
         <w:t>Khena Swallow, PhD - kms424@cornell.edu</w:t>
@@ -979,7 +955,7 @@
     </w:p>
     <w:sectPr>
       <w:pgSz w:w="12240" w:h="15840"/>
-      <w:pgMar w:top="620" w:right="760" w:bottom="620" w:left="760" w:header="708" w:footer="708" w:gutter="0"/>
+      <w:pgMar w:top="460" w:right="760" w:bottom="460" w:left="760" w:header="708" w:footer="708" w:gutter="0"/>
       <w:cols w:space="720"/>
       <w:docGrid w:linePitch="360"/>
     </w:sectPr>

</xml_diff>